<commit_message>
from ofc pc : practice
</commit_message>
<xml_diff>
--- a/SSMS/Interview topics/Lookup transformation.docx
+++ b/SSMS/Interview topics/Lookup transformation.docx
@@ -586,8 +586,17 @@
           <w:sz w:val="28"/>
           <w:szCs w:val="28"/>
         </w:rPr>
-        <w:t xml:space="preserve">(e.g., </w:t>
-      </w:r>
+        <w:t>(e.g., adding product names based on product IDs).</w:t>
+      </w:r>
+    </w:p>
+    <w:p>
+      <w:pPr>
+        <w:rPr>
+          <w:rFonts w:ascii="Times New Roman" w:hAnsi="Times New Roman" w:cs="Times New Roman"/>
+          <w:sz w:val="28"/>
+          <w:szCs w:val="28"/>
+        </w:rPr>
+      </w:pPr>
       <w:proofErr w:type="gramStart"/>
       <w:r>
         <w:rPr>
@@ -595,7 +604,7 @@
           <w:sz w:val="28"/>
           <w:szCs w:val="28"/>
         </w:rPr>
-        <w:t>adding product names based on product IDs).</w:t>
+        <w:t>Handling slowly changing dimensions by looking up historical information for a given key.</w:t>
       </w:r>
       <w:proofErr w:type="gramEnd"/>
     </w:p>
@@ -607,25 +616,6 @@
           <w:szCs w:val="28"/>
         </w:rPr>
       </w:pPr>
-      <w:proofErr w:type="gramStart"/>
-      <w:r>
-        <w:rPr>
-          <w:rFonts w:ascii="Times New Roman" w:hAnsi="Times New Roman" w:cs="Times New Roman"/>
-          <w:sz w:val="28"/>
-          <w:szCs w:val="28"/>
-        </w:rPr>
-        <w:t>Handling slowly changing dimensions by looking up historical information for a given key.</w:t>
-      </w:r>
-      <w:proofErr w:type="gramEnd"/>
-    </w:p>
-    <w:p>
-      <w:pPr>
-        <w:rPr>
-          <w:rFonts w:ascii="Times New Roman" w:hAnsi="Times New Roman" w:cs="Times New Roman"/>
-          <w:sz w:val="28"/>
-          <w:szCs w:val="28"/>
-        </w:rPr>
-      </w:pPr>
     </w:p>
     <w:p>
       <w:pPr>
@@ -679,6 +669,424 @@
         </w:rPr>
         <w:t>, Microsoft SSIS (SQL Server Integration Services), and others, provide functionalities for implementing Lookup transformations in data integration workflows.</w:t>
       </w:r>
+    </w:p>
+    <w:p>
+      <w:pPr>
+        <w:rPr>
+          <w:rFonts w:ascii="Times New Roman" w:hAnsi="Times New Roman" w:cs="Times New Roman"/>
+          <w:sz w:val="28"/>
+          <w:szCs w:val="28"/>
+        </w:rPr>
+      </w:pPr>
+    </w:p>
+    <w:p>
+      <w:pPr>
+        <w:rPr>
+          <w:rFonts w:ascii="Times New Roman" w:hAnsi="Times New Roman" w:cs="Times New Roman"/>
+          <w:sz w:val="28"/>
+          <w:szCs w:val="28"/>
+        </w:rPr>
+      </w:pPr>
+      <w:r>
+        <w:rPr>
+          <w:rFonts w:ascii="Times New Roman" w:hAnsi="Times New Roman" w:cs="Times New Roman"/>
+          <w:sz w:val="28"/>
+          <w:szCs w:val="28"/>
+        </w:rPr>
+        <w:lastRenderedPageBreak/>
+        <w:t>The Lookup Transformation is not a feature specific to SQL Server Management Studio (SSMS) but is rather a component of SQL Server Integration Services (SSIS), which is a part of the Microsoft SQL Server suite.</w:t>
+      </w:r>
+    </w:p>
+    <w:p>
+      <w:pPr>
+        <w:rPr>
+          <w:rFonts w:ascii="Times New Roman" w:hAnsi="Times New Roman" w:cs="Times New Roman"/>
+          <w:sz w:val="28"/>
+          <w:szCs w:val="28"/>
+        </w:rPr>
+      </w:pPr>
+    </w:p>
+    <w:p>
+      <w:pPr>
+        <w:rPr>
+          <w:rFonts w:ascii="Times New Roman" w:hAnsi="Times New Roman" w:cs="Times New Roman"/>
+          <w:sz w:val="28"/>
+          <w:szCs w:val="28"/>
+        </w:rPr>
+      </w:pPr>
+      <w:r>
+        <w:rPr>
+          <w:rFonts w:ascii="Times New Roman" w:hAnsi="Times New Roman" w:cs="Times New Roman"/>
+          <w:sz w:val="28"/>
+          <w:szCs w:val="28"/>
+        </w:rPr>
+        <w:t>In SSIS, the Lookup Transformation is used to look up and retrieve data from a reference dataset based on a specified condition. It is often used to enrich or supplement data in a data flow by matching values from the input dataset with a reference dataset.</w:t>
+      </w:r>
+    </w:p>
+    <w:p>
+      <w:pPr>
+        <w:rPr>
+          <w:rFonts w:ascii="Times New Roman" w:hAnsi="Times New Roman" w:cs="Times New Roman"/>
+          <w:sz w:val="28"/>
+          <w:szCs w:val="28"/>
+        </w:rPr>
+      </w:pPr>
+    </w:p>
+    <w:p>
+      <w:pPr>
+        <w:rPr>
+          <w:rFonts w:ascii="Times New Roman" w:hAnsi="Times New Roman" w:cs="Times New Roman"/>
+          <w:sz w:val="28"/>
+          <w:szCs w:val="28"/>
+        </w:rPr>
+      </w:pPr>
+      <w:r>
+        <w:rPr>
+          <w:rFonts w:ascii="Times New Roman" w:hAnsi="Times New Roman" w:cs="Times New Roman"/>
+          <w:sz w:val="28"/>
+          <w:szCs w:val="28"/>
+        </w:rPr>
+        <w:t>Here's a brief overview of how to use the Lookup Transformation in SSIS:</w:t>
+      </w:r>
+    </w:p>
+    <w:p>
+      <w:pPr>
+        <w:rPr>
+          <w:rFonts w:ascii="Times New Roman" w:hAnsi="Times New Roman" w:cs="Times New Roman"/>
+          <w:sz w:val="28"/>
+          <w:szCs w:val="28"/>
+        </w:rPr>
+      </w:pPr>
+    </w:p>
+    <w:p>
+      <w:pPr>
+        <w:rPr>
+          <w:rFonts w:ascii="Times New Roman" w:hAnsi="Times New Roman" w:cs="Times New Roman"/>
+          <w:b/>
+          <w:sz w:val="28"/>
+          <w:szCs w:val="28"/>
+        </w:rPr>
+      </w:pPr>
+      <w:r>
+        <w:rPr>
+          <w:rFonts w:ascii="Times New Roman" w:hAnsi="Times New Roman" w:cs="Times New Roman"/>
+          <w:b/>
+          <w:sz w:val="28"/>
+          <w:szCs w:val="28"/>
+        </w:rPr>
+        <w:t>Drag and Drop:</w:t>
+      </w:r>
+    </w:p>
+    <w:p>
+      <w:pPr>
+        <w:rPr>
+          <w:rFonts w:ascii="Times New Roman" w:hAnsi="Times New Roman" w:cs="Times New Roman"/>
+          <w:sz w:val="28"/>
+          <w:szCs w:val="28"/>
+        </w:rPr>
+      </w:pPr>
+    </w:p>
+    <w:p>
+      <w:pPr>
+        <w:rPr>
+          <w:rFonts w:ascii="Times New Roman" w:hAnsi="Times New Roman" w:cs="Times New Roman"/>
+          <w:sz w:val="28"/>
+          <w:szCs w:val="28"/>
+        </w:rPr>
+      </w:pPr>
+      <w:r>
+        <w:rPr>
+          <w:rFonts w:ascii="Times New Roman" w:hAnsi="Times New Roman" w:cs="Times New Roman"/>
+          <w:sz w:val="28"/>
+          <w:szCs w:val="28"/>
+        </w:rPr>
+        <w:t>In the SSIS Data Flow tab, drag the Lookup Transformation from the toolbox to the data flow design surface.</w:t>
+      </w:r>
+    </w:p>
+    <w:p>
+      <w:pPr>
+        <w:rPr>
+          <w:rFonts w:ascii="Times New Roman" w:hAnsi="Times New Roman" w:cs="Times New Roman"/>
+          <w:b/>
+          <w:sz w:val="28"/>
+          <w:szCs w:val="28"/>
+        </w:rPr>
+      </w:pPr>
+      <w:r>
+        <w:rPr>
+          <w:rFonts w:ascii="Times New Roman" w:hAnsi="Times New Roman" w:cs="Times New Roman"/>
+          <w:b/>
+          <w:sz w:val="28"/>
+          <w:szCs w:val="28"/>
+        </w:rPr>
+        <w:t>Configure Connection:</w:t>
+      </w:r>
+    </w:p>
+    <w:p>
+      <w:pPr>
+        <w:rPr>
+          <w:rFonts w:ascii="Times New Roman" w:hAnsi="Times New Roman" w:cs="Times New Roman"/>
+          <w:sz w:val="28"/>
+          <w:szCs w:val="28"/>
+        </w:rPr>
+      </w:pPr>
+    </w:p>
+    <w:p>
+      <w:pPr>
+        <w:rPr>
+          <w:rFonts w:ascii="Times New Roman" w:hAnsi="Times New Roman" w:cs="Times New Roman"/>
+          <w:sz w:val="28"/>
+          <w:szCs w:val="28"/>
+        </w:rPr>
+      </w:pPr>
+      <w:r>
+        <w:rPr>
+          <w:rFonts w:ascii="Times New Roman" w:hAnsi="Times New Roman" w:cs="Times New Roman"/>
+          <w:sz w:val="28"/>
+          <w:szCs w:val="28"/>
+        </w:rPr>
+        <w:t>Connect the input dataset (from a source, such as an Excel file or a SQL Server table) to the Lookup Transformation.</w:t>
+      </w:r>
+    </w:p>
+    <w:p>
+      <w:pPr>
+        <w:rPr>
+          <w:rFonts w:ascii="Times New Roman" w:hAnsi="Times New Roman" w:cs="Times New Roman"/>
+          <w:b/>
+          <w:sz w:val="28"/>
+          <w:szCs w:val="28"/>
+        </w:rPr>
+      </w:pPr>
+      <w:r>
+        <w:rPr>
+          <w:rFonts w:ascii="Times New Roman" w:hAnsi="Times New Roman" w:cs="Times New Roman"/>
+          <w:b/>
+          <w:sz w:val="28"/>
+          <w:szCs w:val="28"/>
+        </w:rPr>
+        <w:t>Configure Lookup:</w:t>
+      </w:r>
+    </w:p>
+    <w:p>
+      <w:pPr>
+        <w:rPr>
+          <w:rFonts w:ascii="Times New Roman" w:hAnsi="Times New Roman" w:cs="Times New Roman"/>
+          <w:sz w:val="28"/>
+          <w:szCs w:val="28"/>
+        </w:rPr>
+      </w:pPr>
+    </w:p>
+    <w:p>
+      <w:pPr>
+        <w:rPr>
+          <w:rFonts w:ascii="Times New Roman" w:hAnsi="Times New Roman" w:cs="Times New Roman"/>
+          <w:sz w:val="28"/>
+          <w:szCs w:val="28"/>
+        </w:rPr>
+      </w:pPr>
+      <w:r>
+        <w:rPr>
+          <w:rFonts w:ascii="Times New Roman" w:hAnsi="Times New Roman" w:cs="Times New Roman"/>
+          <w:sz w:val="28"/>
+          <w:szCs w:val="28"/>
+        </w:rPr>
+        <w:t>Configure the Lookup Transformation by specifying the reference dataset (the dataset you want to look up against) and defining the columns used for matching.</w:t>
+      </w:r>
+    </w:p>
+    <w:p>
+      <w:pPr>
+        <w:rPr>
+          <w:rFonts w:ascii="Times New Roman" w:hAnsi="Times New Roman" w:cs="Times New Roman"/>
+          <w:b/>
+          <w:sz w:val="28"/>
+          <w:szCs w:val="28"/>
+        </w:rPr>
+      </w:pPr>
+      <w:r>
+        <w:rPr>
+          <w:rFonts w:ascii="Times New Roman" w:hAnsi="Times New Roman" w:cs="Times New Roman"/>
+          <w:b/>
+          <w:sz w:val="28"/>
+          <w:szCs w:val="28"/>
+        </w:rPr>
+        <w:t>Specify Match Columns:</w:t>
+      </w:r>
+    </w:p>
+    <w:p>
+      <w:pPr>
+        <w:rPr>
+          <w:rFonts w:ascii="Times New Roman" w:hAnsi="Times New Roman" w:cs="Times New Roman"/>
+          <w:sz w:val="28"/>
+          <w:szCs w:val="28"/>
+        </w:rPr>
+      </w:pPr>
+    </w:p>
+    <w:p>
+      <w:pPr>
+        <w:rPr>
+          <w:rFonts w:ascii="Times New Roman" w:hAnsi="Times New Roman" w:cs="Times New Roman"/>
+          <w:sz w:val="28"/>
+          <w:szCs w:val="28"/>
+        </w:rPr>
+      </w:pPr>
+      <w:r>
+        <w:rPr>
+          <w:rFonts w:ascii="Times New Roman" w:hAnsi="Times New Roman" w:cs="Times New Roman"/>
+          <w:sz w:val="28"/>
+          <w:szCs w:val="28"/>
+        </w:rPr>
+        <w:t>Identify the columns in the input dataset that you want to match with the reference dataset.</w:t>
+      </w:r>
+    </w:p>
+    <w:p>
+      <w:pPr>
+        <w:rPr>
+          <w:rFonts w:ascii="Times New Roman" w:hAnsi="Times New Roman" w:cs="Times New Roman"/>
+          <w:sz w:val="28"/>
+          <w:szCs w:val="28"/>
+        </w:rPr>
+      </w:pPr>
+      <w:r>
+        <w:rPr>
+          <w:rFonts w:ascii="Times New Roman" w:hAnsi="Times New Roman" w:cs="Times New Roman"/>
+          <w:sz w:val="28"/>
+          <w:szCs w:val="28"/>
+        </w:rPr>
+        <w:t>Define Output:</w:t>
+      </w:r>
+    </w:p>
+    <w:p>
+      <w:pPr>
+        <w:rPr>
+          <w:rFonts w:ascii="Times New Roman" w:hAnsi="Times New Roman" w:cs="Times New Roman"/>
+          <w:sz w:val="28"/>
+          <w:szCs w:val="28"/>
+        </w:rPr>
+      </w:pPr>
+    </w:p>
+    <w:p>
+      <w:pPr>
+        <w:rPr>
+          <w:rFonts w:ascii="Times New Roman" w:hAnsi="Times New Roman" w:cs="Times New Roman"/>
+          <w:sz w:val="28"/>
+          <w:szCs w:val="28"/>
+        </w:rPr>
+      </w:pPr>
+      <w:r>
+        <w:rPr>
+          <w:rFonts w:ascii="Times New Roman" w:hAnsi="Times New Roman" w:cs="Times New Roman"/>
+          <w:sz w:val="28"/>
+          <w:szCs w:val="28"/>
+        </w:rPr>
+        <w:t>Define how to handle matching and non-matching rows. You can configure options such as redirecting non-matching rows, ignoring failures, or failing the transformation.</w:t>
+      </w:r>
+    </w:p>
+    <w:p>
+      <w:pPr>
+        <w:rPr>
+          <w:rFonts w:ascii="Times New Roman" w:hAnsi="Times New Roman" w:cs="Times New Roman"/>
+          <w:b/>
+          <w:sz w:val="28"/>
+          <w:szCs w:val="28"/>
+        </w:rPr>
+      </w:pPr>
+      <w:r>
+        <w:rPr>
+          <w:rFonts w:ascii="Times New Roman" w:hAnsi="Times New Roman" w:cs="Times New Roman"/>
+          <w:b/>
+          <w:sz w:val="28"/>
+          <w:szCs w:val="28"/>
+        </w:rPr>
+        <w:t>Connect Output:</w:t>
+      </w:r>
+    </w:p>
+    <w:p>
+      <w:pPr>
+        <w:rPr>
+          <w:rFonts w:ascii="Times New Roman" w:hAnsi="Times New Roman" w:cs="Times New Roman"/>
+          <w:sz w:val="28"/>
+          <w:szCs w:val="28"/>
+        </w:rPr>
+      </w:pPr>
+    </w:p>
+    <w:p>
+      <w:pPr>
+        <w:rPr>
+          <w:rFonts w:ascii="Times New Roman" w:hAnsi="Times New Roman" w:cs="Times New Roman"/>
+          <w:sz w:val="28"/>
+          <w:szCs w:val="28"/>
+        </w:rPr>
+      </w:pPr>
+      <w:r>
+        <w:rPr>
+          <w:rFonts w:ascii="Times New Roman" w:hAnsi="Times New Roman" w:cs="Times New Roman"/>
+          <w:sz w:val="28"/>
+          <w:szCs w:val="28"/>
+        </w:rPr>
+        <w:t>Connect the Lookup Transformation to the next component in your data flow, such as a destination or another transformation.</w:t>
+      </w:r>
+    </w:p>
+    <w:p>
+      <w:pPr>
+        <w:rPr>
+          <w:rFonts w:ascii="Times New Roman" w:hAnsi="Times New Roman" w:cs="Times New Roman"/>
+          <w:sz w:val="28"/>
+          <w:szCs w:val="28"/>
+        </w:rPr>
+      </w:pPr>
+      <w:r>
+        <w:rPr>
+          <w:rFonts w:ascii="Times New Roman" w:hAnsi="Times New Roman" w:cs="Times New Roman"/>
+          <w:sz w:val="28"/>
+          <w:szCs w:val="28"/>
+        </w:rPr>
+        <w:t>Keep in mind that SSMS (SQL Server Management Studio) is a tool for managing and querying databases, while SSIS (SQL Server Integration Services) is a separate tool for building data integration and transformation workflows. If you are working with SSIS, you would typically design and execute your packages using SQL Server Data Tools (SSDT) rather than SSMS.</w:t>
+      </w:r>
+    </w:p>
+    <w:p>
+      <w:pPr>
+        <w:rPr>
+          <w:rFonts w:ascii="Times New Roman" w:hAnsi="Times New Roman" w:cs="Times New Roman"/>
+          <w:sz w:val="28"/>
+          <w:szCs w:val="28"/>
+        </w:rPr>
+      </w:pPr>
+    </w:p>
+    <w:p>
+      <w:pPr>
+        <w:rPr>
+          <w:rFonts w:ascii="Times New Roman" w:hAnsi="Times New Roman" w:cs="Times New Roman"/>
+          <w:sz w:val="28"/>
+          <w:szCs w:val="28"/>
+        </w:rPr>
+      </w:pPr>
+    </w:p>
+    <w:p>
+      <w:pPr>
+        <w:rPr>
+          <w:rFonts w:ascii="Times New Roman" w:hAnsi="Times New Roman" w:cs="Times New Roman"/>
+          <w:sz w:val="28"/>
+          <w:szCs w:val="28"/>
+        </w:rPr>
+      </w:pPr>
+    </w:p>
+    <w:p>
+      <w:pPr>
+        <w:rPr>
+          <w:rFonts w:ascii="Times New Roman" w:hAnsi="Times New Roman" w:cs="Times New Roman"/>
+          <w:sz w:val="28"/>
+          <w:szCs w:val="28"/>
+        </w:rPr>
+      </w:pPr>
+    </w:p>
+    <w:p>
+      <w:pPr>
+        <w:rPr>
+          <w:rFonts w:ascii="Times New Roman" w:hAnsi="Times New Roman" w:cs="Times New Roman"/>
+          <w:sz w:val="28"/>
+          <w:szCs w:val="28"/>
+        </w:rPr>
+      </w:pPr>
     </w:p>
     <w:sectPr>
       <w:pgSz w:w="12240" w:h="15840"/>
@@ -1172,7 +1580,7 @@
   <a:extraClrSchemeLst/>
   <a:extLst>
     <a:ext uri="{05A4C25C-085E-4340-85A3-A5531E510DB2}">
-      <thm15:themeFamily xmlns:thm15="http://schemas.microsoft.com/office/thememl/2012/main" xmlns="" name="Office Theme" id="{62F939B6-93AF-4DB8-9C6B-D6C7DFDC589F}" vid="{4A3C46E8-61CC-4603-A589-7422A47A8E4A}"/>
+      <thm15:themeFamily xmlns="" xmlns:thm15="http://schemas.microsoft.com/office/thememl/2012/main" name="Office Theme" id="{62F939B6-93AF-4DB8-9C6B-D6C7DFDC589F}" vid="{4A3C46E8-61CC-4603-A589-7422A47A8E4A}"/>
     </a:ext>
   </a:extLst>
 </a:theme>

</xml_diff>